<commit_message>
Roteiro Bruno & Marrone: revisão da parte 2
Co-Authored-By: Claude Opus 5.5 <noreply@anthropic.com>
Claude-Session: https://claude.ai/code/session_01MJjUEEZrxQDEUifKK2vj9g
</commit_message>
<xml_diff>
--- a/roteiros/bruno-marrone/BrunoMarrone_Parte2.docx
+++ b/roteiros/bruno-marrone/BrunoMarrone_Parte2.docx
@@ -39,7 +39,7 @@
         <w:rPr>
           <w:color w:val="000000"/>
         </w:rPr>
-        <w:t>E, depois de quinze anos esperando, a vez deles chegou de uma só vez.</w:t>
+        <w:t>Depois de quinze anos esperando, a vez deles chegou de uma só vez.</w:t>
       </w:r>
     </w:p>
     <w:p>
@@ -79,7 +79,7 @@
         <w:rPr>
           <w:color w:val="000000"/>
         </w:rPr>
-        <w:t>E, durante cerca de quinze anos, Bruno e Marrone foram a dupla mais tocada nas rádios brasileiras.</w:t>
+        <w:t>Durante cerca de quinze anos, Bruno e Marrone foram a dupla mais tocada nas rádios brasileiras.</w:t>
       </w:r>
     </w:p>
     <w:p>
@@ -87,7 +87,7 @@
         <w:rPr>
           <w:color w:val="C00000"/>
         </w:rPr>
-        <w:t>Faça essa conta. Quinze anos esperando o sucesso. E, quando ele chegou, mais quinze anos no topo das rádios. Trinta anos de estrada, de palco e de bar. Agora pense no que trinta anos de palco e de balcão de bar fazem com uma pessoa.</w:t>
+        <w:t>Faça essa conta. Quinze anos esperando o sucesso. E, quando ele chegou, mais quinze anos no topo das rádios. Trinta anos de estrada. Agora pense no que três décadas de palco e de balcão de bar fazem com uma pessoa.</w:t>
       </w:r>
     </w:p>
     <w:p>
@@ -103,7 +103,7 @@
         <w:rPr>
           <w:color w:val="000000"/>
         </w:rPr>
-        <w:t>A agenda passou a ter shows quase todos os dias, com voos e festas depois dos shows. O dinheiro e a fama chegaram juntos. E com ela veio a pressão de subir ao palco noite após noite e entregar a mesma energia para plateias de dezenas de milhares de pessoas.</w:t>
+        <w:t>A agenda passou a ter shows quase todos os dias, com voos e festas depois dos shows. O dinheiro e a fama chegaram juntos. E, com eles, veio a pressão de subir ao palco noite após noite e entregar a mesma energia para plateias de dezenas de milhares de pessoas.</w:t>
       </w:r>
     </w:p>
     <w:p>
@@ -223,7 +223,7 @@
         <w:rPr>
           <w:color w:val="000000"/>
         </w:rPr>
-        <w:t>Os outros dois ocupantes não tiveram a mesma sorte. O piloto, Almir Carlos Bezerra, sofreu ferimentos tão graves que precisou ter o pé esquerdo amputado. Jardel Alves Borges, primo e assistente de Marrone, teve traumatismo craniano, várias fraturas e lesões internas.</w:t>
+        <w:t>Os outros dois ocupantes não tiveram a mesma sorte. O piloto, Almir Carlos Bezerra, sofreu ferimentos tão graves que precisou ter o pé esquerdo amputado. Jardel Alves Borges, primo e assistente de Marrone, teve traumatismo craniano e várias fraturas.</w:t>
       </w:r>
     </w:p>
     <w:p>
@@ -335,7 +335,7 @@
         <w:rPr>
           <w:color w:val="000000"/>
         </w:rPr>
-        <w:t>E o que os fãs gravaram com o celular naquela madrugada deixou muita gente em choque.</w:t>
+        <w:t>O que os fãs gravaram com o celular naquela madrugada deixou muita gente em choque.</w:t>
       </w:r>
     </w:p>
     <w:p>

</xml_diff>